<commit_message>
ilsd motion-brief: complete transcription of FILED-EXAMPLE-motion-brief (fb-w0vj.1)
fb diff --content: G0 PASS (7 pages); G2 residuals template-driven only.
</commit_message>
<xml_diff>
--- a/courts/seventh-circuit/illinois/federal/southern-district/motion-brief/usage/OUTPUT-motion-brief.docx
+++ b/courts/seventh-circuit/illinois/federal/southern-district/motion-brief/usage/OUTPUT-motion-brief.docx
@@ -227,7 +227,7 @@
     </w:p>
     <w:p>
       <w:pPr>
-        <w:pStyle w:val="BodyText"/>
+        <w:pStyle w:val="FirstParagraph"/>
       </w:pPr>
       <w:r>
         <w:t xml:space="preserve">Pursuant to Rules 12(b)(6) and 12(f) of the Federal Rules of Civil Procedure, Defendant, The Lincoln National Life Insurance Company (incorrectly named in the Complaint as Lincoln Financial Group)</w:t>
@@ -236,7 +236,7 @@
         <w:rPr>
           <w:rStyle w:val="FootnoteReference"/>
         </w:rPr>
-        <w:footnoteReference w:id="20"/>
+        <w:footnoteReference w:id="109"/>
       </w:r>
       <w:r>
         <w:t xml:space="preserve"> </w:t>
@@ -293,7 +293,7 @@
         <w:rPr>
           <w:rStyle w:val="FootnoteReference"/>
         </w:rPr>
-        <w:footnoteReference w:id="21"/>
+        <w:footnoteReference w:id="110"/>
       </w:r>
       <w:r>
         <w:t xml:space="preserve"> </w:t>
@@ -311,7 +311,7 @@
         <w:rPr>
           <w:rStyle w:val="FootnoteReference"/>
         </w:rPr>
-        <w:footnoteReference w:id="22"/>
+        <w:footnoteReference w:id="111"/>
       </w:r>
       <w:r>
         <w:t xml:space="preserve"> </w:t>
@@ -323,7 +323,7 @@
         <w:rPr>
           <w:rStyle w:val="FootnoteReference"/>
         </w:rPr>
-        <w:footnoteReference w:id="23"/>
+        <w:footnoteReference w:id="112"/>
       </w:r>
       <w:r>
         <w:t xml:space="preserve"> </w:t>
@@ -335,7 +335,7 @@
         <w:rPr>
           <w:rStyle w:val="FootnoteReference"/>
         </w:rPr>
-        <w:footnoteReference w:id="24"/>
+        <w:footnoteReference w:id="113"/>
       </w:r>
       <w:r>
         <w:t xml:space="preserve"> </w:t>
@@ -407,7 +407,7 @@
         <w:rPr>
           <w:rStyle w:val="FootnoteReference"/>
         </w:rPr>
-        <w:footnoteReference w:id="25"/>
+        <w:footnoteReference w:id="114"/>
       </w:r>
       <w:r>
         <w:t xml:space="preserve"> </w:t>
@@ -419,7 +419,7 @@
         <w:rPr>
           <w:rStyle w:val="FootnoteReference"/>
         </w:rPr>
-        <w:footnoteReference w:id="26"/>
+        <w:footnoteReference w:id="115"/>
       </w:r>
       <w:r>
         <w:t xml:space="preserve"> </w:t>
@@ -431,7 +431,7 @@
         <w:rPr>
           <w:rStyle w:val="FootnoteReference"/>
         </w:rPr>
-        <w:footnoteReference w:id="27"/>
+        <w:footnoteReference w:id="116"/>
       </w:r>
       <w:r>
         <w:t xml:space="preserve"> </w:t>
@@ -451,7 +451,7 @@
         <w:rPr>
           <w:rStyle w:val="FootnoteReference"/>
         </w:rPr>
-        <w:footnoteReference w:id="28"/>
+        <w:footnoteReference w:id="117"/>
       </w:r>
       <w:r>
         <w:t xml:space="preserve"> </w:t>
@@ -475,7 +475,7 @@
         <w:rPr>
           <w:rStyle w:val="FootnoteReference"/>
         </w:rPr>
-        <w:footnoteReference w:id="29"/>
+        <w:footnoteReference w:id="118"/>
       </w:r>
       <w:r>
         <w:t xml:space="preserve"> </w:t>
@@ -698,7 +698,7 @@
         <w:rPr>
           <w:rStyle w:val="FootnoteReference"/>
         </w:rPr>
-        <w:footnoteReference w:id="30"/>
+        <w:footnoteReference w:id="119"/>
       </w:r>
       <w:r>
         <w:t xml:space="preserve"> </w:t>
@@ -710,7 +710,7 @@
         <w:rPr>
           <w:rStyle w:val="FootnoteReference"/>
         </w:rPr>
-        <w:footnoteReference w:id="31"/>
+        <w:footnoteReference w:id="120"/>
       </w:r>
       <w:r>
         <w:t xml:space="preserve"> </w:t>
@@ -1006,7 +1006,7 @@
         <w:pStyle w:val="SigIndent30"/>
       </w:pPr>
       <w:r>
-        <w:t xml:space="preserve">Attorney in Charge</w:t>
+        <w:t xml:space="preserve">Iwana Rademaekers, Attorney in Charge</w:t>
       </w:r>
     </w:p>
     <w:p>
@@ -1157,12 +1157,12 @@
       </w:r>
     </w:p>
     <w:sectPr>
-      <w:footerReference r:id="rId9" w:type="default"/>
+      <w:footerReference w:type="default" r:id="rId100"/>
       <w:footnotePr>
         <w:numRestart w:val="eachSect"/>
       </w:footnotePr>
-      <w:pgSz w:h="15840" w:w="12240"/>
-      <w:pgMar w:bottom="1440" w:footer="720" w:gutter="0" w:header="720" w:left="1440" w:right="1440" w:top="1440"/>
+      <w:pgSz w:w="12240" w:h="15840"/>
+      <w:pgMar w:top="1440" w:right="1440" w:bottom="1440" w:left="1440" w:header="720" w:footer="720" w:gutter="0"/>
     </w:sectPr>
   </w:body>
 </w:document>
@@ -1213,7 +1213,7 @@
       </w:r>
     </w:p>
   </w:footnote>
-  <w:footnote w:id="20">
+  <w:footnote w:id="109">
     <w:p>
       <w:pPr>
         <w:pStyle w:val="FootnoteText"/>
@@ -1256,7 +1256,7 @@
       </w:r>
     </w:p>
   </w:footnote>
-  <w:footnote w:id="21">
+  <w:footnote w:id="110">
     <w:p>
       <w:pPr>
         <w:pStyle w:val="FootnoteText"/>
@@ -1266,116 +1266,6 @@
           <w:rStyle w:val="FootnoteReference"/>
         </w:rPr>
         <w:footnoteRef/>
-      </w:r>
-      <w:r>
-        <w:t xml:space="preserve"> </w:t>
-      </w:r>
-      <w:r>
-        <w:t xml:space="preserve">See Complaint at ¶ 17 and the WHEREFORE paragraph.</w:t>
-      </w:r>
-    </w:p>
-  </w:footnote>
-  <w:footnote w:id="22">
-    <w:p>
-      <w:pPr>
-        <w:pStyle w:val="FootnoteText"/>
-      </w:pPr>
-      <w:r>
-        <w:rPr>
-          <w:rStyle w:val="FootnoteReference"/>
-        </w:rPr>
-        <w:footnoteRef/>
-      </w:r>
-      <w:r>
-        <w:t xml:space="preserve"> </w:t>
-      </w:r>
-      <w:r>
-        <w:t xml:space="preserve">See Complaint, WHEREFORE Paragraph.</w:t>
-      </w:r>
-    </w:p>
-  </w:footnote>
-  <w:footnote w:id="23">
-    <w:p>
-      <w:pPr>
-        <w:pStyle w:val="FootnoteText"/>
-      </w:pPr>
-      <w:r>
-        <w:rPr>
-          <w:rStyle w:val="FootnoteReference"/>
-        </w:rPr>
-        <w:footnoteRef/>
-      </w:r>
-      <w:r>
-        <w:t xml:space="preserve"> </w:t>
-      </w:r>
-      <w:r>
-        <w:t xml:space="preserve">For the purposes of the Motion to Dismiss, the Court must assume the facts alleged by Plaintiff in the Complaint to be true. However, Defendant does not admit the truthfulness or accuracy of any factual allegation contained in the Complaint by filing this Motion and Brief or by any statement contained therein.</w:t>
-      </w:r>
-    </w:p>
-  </w:footnote>
-  <w:footnote w:id="24">
-    <w:p>
-      <w:pPr>
-        <w:pStyle w:val="FootnoteText"/>
-      </w:pPr>
-      <w:r>
-        <w:rPr>
-          <w:rStyle w:val="FootnoteReference"/>
-        </w:rPr>
-        <w:footnoteRef/>
-      </w:r>
-      <w:r>
-        <w:t xml:space="preserve"> </w:t>
-      </w:r>
-      <w:r>
-        <w:t xml:space="preserve">See the Caption of the Complaint.</w:t>
-      </w:r>
-    </w:p>
-  </w:footnote>
-  <w:footnote w:id="25">
-    <w:p>
-      <w:pPr>
-        <w:pStyle w:val="FootnoteText"/>
-      </w:pPr>
-      <w:r>
-        <w:rPr>
-          <w:rStyle w:val="FootnoteReference"/>
-        </w:rPr>
-        <w:footnoteRef/>
-      </w:r>
-      <w:r>
-        <w:t xml:space="preserve"> </w:t>
-      </w:r>
-      <w:r>
-        <w:t xml:space="preserve">Fed. R. Civ. P. 12(b)(6).</w:t>
-      </w:r>
-    </w:p>
-  </w:footnote>
-  <w:footnote w:id="26">
-    <w:p>
-      <w:pPr>
-        <w:pStyle w:val="FootnoteText"/>
-      </w:pPr>
-      <w:r>
-        <w:rPr>
-          <w:rStyle w:val="FootnoteReference"/>
-        </w:rPr>
-        <w:footnoteRef/>
-      </w:r>
-      <w:r>
-        <w:t xml:space="preserve"> </w:t>
-      </w:r>
-      <w:r>
-        <w:t xml:space="preserve">“A complaint must contain sufficient factual matter, accepted as true, to</w:t>
-      </w:r>
-      <w:r>
-        <w:t xml:space="preserve"> </w:t>
-      </w:r>
-      <w:r>
-        <w:t xml:space="preserve">‘state a claim to relief that is plausible on its face.’</w:t>
-      </w:r>
-      <w:r>
-        <w:t xml:space="preserve">”</w:t>
       </w:r>
       <w:r>
         <w:t xml:space="preserve"> </w:t>
@@ -1385,14 +1275,17 @@
           <w:i/>
           <w:iCs/>
         </w:rPr>
-        <w:t xml:space="preserve">Bell Atlantic Corp. v. Twombly</w:t>
-      </w:r>
-      <w:r>
-        <w:t xml:space="preserve">, 550 U.S. 544, 555 (2007).</w:t>
+        <w:t xml:space="preserve">See</w:t>
+      </w:r>
+      <w:r>
+        <w:t xml:space="preserve"> </w:t>
+      </w:r>
+      <w:r>
+        <w:t xml:space="preserve">Complaint at ¶ 17 and the WHEREFORE paragraph.</w:t>
       </w:r>
     </w:p>
   </w:footnote>
-  <w:footnote w:id="27">
+  <w:footnote w:id="111">
     <w:p>
       <w:pPr>
         <w:pStyle w:val="FootnoteText"/>
@@ -1411,6 +1304,143 @@
           <w:i/>
           <w:iCs/>
         </w:rPr>
+        <w:t xml:space="preserve">See</w:t>
+      </w:r>
+      <w:r>
+        <w:t xml:space="preserve"> </w:t>
+      </w:r>
+      <w:r>
+        <w:t xml:space="preserve">Complaint, WHEREFORE Paragraph.</w:t>
+      </w:r>
+    </w:p>
+  </w:footnote>
+  <w:footnote w:id="112">
+    <w:p>
+      <w:pPr>
+        <w:pStyle w:val="FootnoteText"/>
+      </w:pPr>
+      <w:r>
+        <w:rPr>
+          <w:rStyle w:val="FootnoteReference"/>
+        </w:rPr>
+        <w:footnoteRef/>
+      </w:r>
+      <w:r>
+        <w:t xml:space="preserve"> </w:t>
+      </w:r>
+      <w:r>
+        <w:t xml:space="preserve">For the purposes of the Motion to Dismiss, the Court must assume the facts alleged by Plaintiff in the Complaint to be true. However, Defendant does not admit the truthfulness or accuracy of any factual allegation contained in the Complaint by filing this Motion and Brief or by any statement contained therein.</w:t>
+      </w:r>
+    </w:p>
+  </w:footnote>
+  <w:footnote w:id="113">
+    <w:p>
+      <w:pPr>
+        <w:pStyle w:val="FootnoteText"/>
+      </w:pPr>
+      <w:r>
+        <w:rPr>
+          <w:rStyle w:val="FootnoteReference"/>
+        </w:rPr>
+        <w:footnoteRef/>
+      </w:r>
+      <w:r>
+        <w:t xml:space="preserve"> </w:t>
+      </w:r>
+      <w:r>
+        <w:rPr>
+          <w:i/>
+          <w:iCs/>
+        </w:rPr>
+        <w:t xml:space="preserve">See</w:t>
+      </w:r>
+      <w:r>
+        <w:t xml:space="preserve"> </w:t>
+      </w:r>
+      <w:r>
+        <w:t xml:space="preserve">the Caption of the Complaint.</w:t>
+      </w:r>
+    </w:p>
+  </w:footnote>
+  <w:footnote w:id="114">
+    <w:p>
+      <w:pPr>
+        <w:pStyle w:val="FootnoteText"/>
+      </w:pPr>
+      <w:r>
+        <w:rPr>
+          <w:rStyle w:val="FootnoteReference"/>
+        </w:rPr>
+        <w:footnoteRef/>
+      </w:r>
+      <w:r>
+        <w:t xml:space="preserve"> </w:t>
+      </w:r>
+      <w:r>
+        <w:t xml:space="preserve">Fed. R. Civ. P. 12(b)(6).</w:t>
+      </w:r>
+    </w:p>
+  </w:footnote>
+  <w:footnote w:id="115">
+    <w:p>
+      <w:pPr>
+        <w:pStyle w:val="FootnoteText"/>
+      </w:pPr>
+      <w:r>
+        <w:rPr>
+          <w:rStyle w:val="FootnoteReference"/>
+        </w:rPr>
+        <w:footnoteRef/>
+      </w:r>
+      <w:r>
+        <w:t xml:space="preserve"> </w:t>
+      </w:r>
+      <w:r>
+        <w:t xml:space="preserve">“A complaint must contain sufficient factual matter, accepted as true, to</w:t>
+      </w:r>
+      <w:r>
+        <w:t xml:space="preserve"> </w:t>
+      </w:r>
+      <w:r>
+        <w:t xml:space="preserve">‘state a claim to relief that is plausible on its face.’</w:t>
+      </w:r>
+      <w:r>
+        <w:t xml:space="preserve">”</w:t>
+      </w:r>
+      <w:r>
+        <w:t xml:space="preserve"> </w:t>
+      </w:r>
+      <w:r>
+        <w:rPr>
+          <w:i/>
+          <w:iCs/>
+        </w:rPr>
+        <w:t xml:space="preserve">Bell Atlantic Corp. v. Twombly</w:t>
+      </w:r>
+      <w:r>
+        <w:t xml:space="preserve">, 550 U.S. 544, 555 (2007).</w:t>
+      </w:r>
+    </w:p>
+  </w:footnote>
+  <w:footnote w:id="116">
+    <w:p>
+      <w:pPr>
+        <w:pStyle w:val="FootnoteText"/>
+      </w:pPr>
+      <w:r>
+        <w:rPr>
+          <w:rStyle w:val="FootnoteReference"/>
+        </w:rPr>
+        <w:footnoteRef/>
+      </w:r>
+      <w:r>
+        <w:t xml:space="preserve"> </w:t>
+      </w:r>
+      <w:r>
+        <w:rPr>
+          <w:i/>
+          <w:iCs/>
+        </w:rPr>
         <w:t xml:space="preserve">Ashcroft v. Iqbal</w:t>
       </w:r>
       <w:r>
@@ -1418,7 +1448,7 @@
       </w:r>
     </w:p>
   </w:footnote>
-  <w:footnote w:id="28">
+  <w:footnote w:id="117">
     <w:p>
       <w:pPr>
         <w:pStyle w:val="FootnoteText"/>
@@ -1437,7 +1467,7 @@
       </w:r>
     </w:p>
   </w:footnote>
-  <w:footnote w:id="29">
+  <w:footnote w:id="118">
     <w:p>
       <w:pPr>
         <w:pStyle w:val="FootnoteText"/>
@@ -1456,7 +1486,7 @@
       </w:r>
     </w:p>
   </w:footnote>
-  <w:footnote w:id="30">
+  <w:footnote w:id="119">
     <w:p>
       <w:pPr>
         <w:pStyle w:val="FootnoteText"/>
@@ -1471,7 +1501,17 @@
         <w:t xml:space="preserve"> </w:t>
       </w:r>
       <w:r>
-        <w:t xml:space="preserve">See Complaint at ¶ 1 and Exhibit A thereto; Plan Documents, Exhibits</w:t>
+        <w:rPr>
+          <w:i/>
+          <w:iCs/>
+        </w:rPr>
+        <w:t xml:space="preserve">See</w:t>
+      </w:r>
+      <w:r>
+        <w:t xml:space="preserve"> </w:t>
+      </w:r>
+      <w:r>
+        <w:t xml:space="preserve">Complaint at ¶ 1 and Exhibit A thereto; Plan Documents, Exhibits</w:t>
       </w:r>
       <w:r>
         <w:t xml:space="preserve"> </w:t>
@@ -1511,7 +1551,7 @@
       </w:r>
     </w:p>
   </w:footnote>
-  <w:footnote w:id="31">
+  <w:footnote w:id="120">
     <w:p>
       <w:pPr>
         <w:pStyle w:val="FootnoteText"/>
@@ -1526,7 +1566,17 @@
         <w:t xml:space="preserve"> </w:t>
       </w:r>
       <w:r>
-        <w:t xml:space="preserve">See Complaint at ¶¶ 4, 11, 14, and 16-17.</w:t>
+        <w:rPr>
+          <w:i/>
+          <w:iCs/>
+        </w:rPr>
+        <w:t xml:space="preserve">See</w:t>
+      </w:r>
+      <w:r>
+        <w:t xml:space="preserve"> </w:t>
+      </w:r>
+      <w:r>
+        <w:t xml:space="preserve">Complaint at ¶¶ 4, 11, 14, and 16-17.</w:t>
       </w:r>
     </w:p>
   </w:footnote>
@@ -1622,59 +1672,59 @@
   <w:docDefaults>
     <w:rPrDefault>
       <w:rPr>
-        <w:rFonts w:ascii="EB Garamond" w:cs="EB Garamond" w:eastAsia="EB Garamond" w:hAnsi="EB Garamond"/>
+        <w:rFonts w:ascii="EB Garamond" w:hAnsi="EB Garamond" w:eastAsia="EB Garamond" w:cs="EB Garamond"/>
         <w:sz w:val="24"/>
         <w:szCs w:val="24"/>
-        <w:lang w:bidi="ar-SA" w:eastAsia="en-US" w:val="en-US"/>
+        <w:lang w:val="en-US" w:eastAsia="en-US" w:bidi="ar-SA"/>
       </w:rPr>
     </w:rPrDefault>
     <w:pPrDefault>
       <w:pPr>
-        <w:spacing w:after="0" w:before="0" w:line="240" w:lineRule="auto"/>
+        <w:spacing w:before="0" w:after="0" w:line="240" w:lineRule="auto"/>
       </w:pPr>
     </w:pPrDefault>
   </w:docDefaults>
-  <w:latentStyles w:count="276" w:defLockedState="0" w:defQFormat="0" w:defSemiHidden="0" w:defUIPriority="0" w:defUnhideWhenUsed="0"/>
-  <w:style w:default="1" w:styleId="Normal" w:type="paragraph">
+  <w:latentStyles w:defLockedState="0" w:defUIPriority="0" w:defSemiHidden="0" w:defUnhideWhenUsed="0" w:defQFormat="0" w:count="276"/>
+  <w:style w:type="paragraph" w:default="1" w:styleId="Normal">
     <w:name w:val="Normal"/>
     <w:qFormat/>
     <w:pPr>
-      <w:spacing w:after="0" w:before="0" w:line="240" w:lineRule="auto"/>
-    </w:pPr>
-    <w:rPr>
-      <w:rFonts w:ascii="EB Garamond" w:cs="EB Garamond" w:eastAsia="EB Garamond" w:hAnsi="EB Garamond"/>
+      <w:spacing w:before="0" w:after="0" w:line="240" w:lineRule="auto"/>
+    </w:pPr>
+    <w:rPr>
+      <w:rFonts w:ascii="EB Garamond" w:hAnsi="EB Garamond" w:eastAsia="EB Garamond" w:cs="EB Garamond"/>
       <w:color w:val="000000"/>
       <w:sz w:val="24"/>
       <w:szCs w:val="24"/>
     </w:rPr>
   </w:style>
-  <w:style w:styleId="BodyText" w:type="paragraph">
+  <w:style w:type="paragraph" w:styleId="BodyText">
     <w:name w:val="Body Text"/>
     <w:basedOn w:val="Normal"/>
     <w:qFormat/>
     <w:pPr>
-      <w:spacing w:after="0" w:before="0" w:line="480" w:lineRule="exact"/>
+      <w:spacing w:before="0" w:after="0" w:line="480" w:lineRule="exact"/>
       <w:ind w:firstLine="720"/>
     </w:pPr>
   </w:style>
-  <w:style w:customStyle="1" w:styleId="FirstParagraph" w:type="paragraph">
+  <w:style w:type="paragraph" w:customStyle="1" w:styleId="FirstParagraph">
     <w:name w:val="First Paragraph"/>
     <w:basedOn w:val="BodyText"/>
     <w:qFormat/>
     <w:pPr>
-      <w:spacing w:after="0" w:before="0" w:line="480" w:lineRule="exact"/>
+      <w:spacing w:before="0" w:after="0" w:line="480" w:lineRule="exact"/>
       <w:ind w:firstLine="720"/>
     </w:pPr>
   </w:style>
-  <w:style w:customStyle="1" w:styleId="Compact" w:type="paragraph">
+  <w:style w:type="paragraph" w:customStyle="1" w:styleId="Compact">
     <w:name w:val="Compact"/>
     <w:basedOn w:val="BodyText"/>
     <w:qFormat/>
     <w:pPr>
-      <w:spacing w:after="36" w:before="36"/>
-    </w:pPr>
-  </w:style>
-  <w:style w:styleId="Title" w:type="paragraph">
+      <w:spacing w:before="36" w:after="36"/>
+    </w:pPr>
+  </w:style>
+  <w:style w:type="paragraph" w:styleId="Title">
     <w:name w:val="Title"/>
     <w:basedOn w:val="Normal"/>
     <w:next w:val="BodyText"/>
@@ -1688,24 +1738,24 @@
       <w:jc w:val="center"/>
     </w:pPr>
     <w:rPr>
-      <w:rFonts w:asciiTheme="majorHAnsi" w:cstheme="majorBidi" w:eastAsiaTheme="majorEastAsia" w:hAnsiTheme="majorHAnsi"/>
+      <w:rFonts w:asciiTheme="majorHAnsi" w:eastAsiaTheme="majorEastAsia" w:hAnsiTheme="majorHAnsi" w:cstheme="majorBidi"/>
       <w:sz w:val="56"/>
       <w:szCs w:val="56"/>
     </w:rPr>
   </w:style>
-  <w:style w:customStyle="1" w:styleId="TitleChar" w:type="character">
+  <w:style w:type="character" w:customStyle="1" w:styleId="TitleChar">
     <w:name w:val="Title Char"/>
     <w:basedOn w:val="DefaultParagraphFont"/>
     <w:link w:val="Title"/>
     <w:uiPriority w:val="10"/>
     <w:rsid w:val="00A10FD9"/>
     <w:rPr>
-      <w:rFonts w:asciiTheme="majorHAnsi" w:cstheme="majorBidi" w:eastAsiaTheme="majorEastAsia" w:hAnsiTheme="majorHAnsi"/>
+      <w:rFonts w:asciiTheme="majorHAnsi" w:eastAsiaTheme="majorEastAsia" w:hAnsiTheme="majorHAnsi" w:cstheme="majorBidi"/>
       <w:sz w:val="56"/>
       <w:szCs w:val="56"/>
     </w:rPr>
   </w:style>
-  <w:style w:styleId="Subtitle" w:type="paragraph">
+  <w:style w:type="paragraph" w:styleId="Subtitle">
     <w:name w:val="Subtitle"/>
     <w:basedOn w:val="Title"/>
     <w:next w:val="BodyText"/>
@@ -1719,27 +1769,27 @@
       </w:numPr>
     </w:pPr>
     <w:rPr>
-      <w:rFonts w:cstheme="majorBidi" w:eastAsiaTheme="majorEastAsia"/>
+      <w:rFonts w:eastAsiaTheme="majorEastAsia" w:cstheme="majorBidi"/>
       <w:spacing w:val="15"/>
       <w:sz w:val="28"/>
       <w:szCs w:val="28"/>
     </w:rPr>
   </w:style>
-  <w:style w:customStyle="1" w:styleId="SubtitleChar" w:type="character">
+  <w:style w:type="character" w:customStyle="1" w:styleId="SubtitleChar">
     <w:name w:val="Subtitle Char"/>
     <w:basedOn w:val="DefaultParagraphFont"/>
     <w:link w:val="Subtitle"/>
     <w:uiPriority w:val="11"/>
     <w:rsid w:val="00A10FD9"/>
     <w:rPr>
-      <w:rFonts w:cstheme="majorBidi" w:eastAsiaTheme="majorEastAsia"/>
-      <w:color w:themeColor="text1" w:themeTint="A6" w:val="595959"/>
+      <w:rFonts w:eastAsiaTheme="majorEastAsia" w:cstheme="majorBidi"/>
+      <w:color w:val="595959" w:themeColor="text1" w:themeTint="A6"/>
       <w:spacing w:val="15"/>
       <w:sz w:val="28"/>
       <w:szCs w:val="28"/>
     </w:rPr>
   </w:style>
-  <w:style w:customStyle="1" w:styleId="Author" w:type="paragraph">
+  <w:style w:type="paragraph" w:customStyle="1" w:styleId="Author">
     <w:name w:val="Author"/>
     <w:basedOn w:val="Title"/>
     <w:next w:val="BodyText"/>
@@ -1753,7 +1803,7 @@
       <w:szCs w:val="24"/>
     </w:rPr>
   </w:style>
-  <w:style w:styleId="Date" w:type="paragraph">
+  <w:style w:type="paragraph" w:styleId="Date">
     <w:name w:val="Date"/>
     <w:basedOn w:val="Title"/>
     <w:next w:val="BodyText"/>
@@ -1767,7 +1817,7 @@
       <w:szCs w:val="24"/>
     </w:rPr>
   </w:style>
-  <w:style w:customStyle="1" w:styleId="AbstractTitle" w:type="paragraph">
+  <w:style w:type="paragraph" w:customStyle="1" w:styleId="AbstractTitle">
     <w:name w:val="Abstract Title"/>
     <w:basedOn w:val="Normal"/>
     <w:next w:val="Abstract"/>
@@ -1775,7 +1825,7 @@
     <w:pPr>
       <w:keepNext/>
       <w:keepLines/>
-      <w:spacing w:after="0" w:before="300"/>
+      <w:spacing w:before="300" w:after="0"/>
       <w:jc w:val="center"/>
     </w:pPr>
     <w:rPr>
@@ -1784,7 +1834,7 @@
       <w:szCs w:val="20"/>
     </w:rPr>
   </w:style>
-  <w:style w:customStyle="1" w:styleId="Abstract" w:type="paragraph">
+  <w:style w:type="paragraph" w:customStyle="1" w:styleId="Abstract">
     <w:name w:val="Abstract"/>
     <w:basedOn w:val="Normal"/>
     <w:next w:val="BodyText"/>
@@ -1792,14 +1842,14 @@
     <w:pPr>
       <w:keepNext/>
       <w:keepLines/>
-      <w:spacing w:after="300" w:before="100"/>
+      <w:spacing w:before="100" w:after="300"/>
     </w:pPr>
     <w:rPr>
       <w:sz w:val="20"/>
       <w:szCs w:val="20"/>
     </w:rPr>
   </w:style>
-  <w:style w:styleId="Bibliography" w:type="paragraph">
+  <w:style w:type="paragraph" w:styleId="Bibliography">
     <w:name w:val="Bibliography"/>
     <w:basedOn w:val="Normal"/>
     <w:next w:val="Bibliography"/>
@@ -1807,7 +1857,7 @@
     <w:pPr/>
     <w:rPr/>
   </w:style>
-  <w:style w:styleId="Heading1" w:type="paragraph">
+  <w:style w:type="paragraph" w:styleId="Heading1">
     <w:name w:val="heading 1"/>
     <w:basedOn w:val="Normal"/>
     <w:next w:val="BodyText"/>
@@ -1816,12 +1866,12 @@
     <w:pPr>
       <w:keepNext/>
       <w:keepLines/>
-      <w:spacing w:after="120" w:before="360" w:line="240" w:lineRule="auto"/>
+      <w:spacing w:before="360" w:after="120" w:line="240" w:lineRule="auto"/>
       <w:jc w:val="center"/>
       <w:outlineLvl w:val="0"/>
     </w:pPr>
     <w:rPr>
-      <w:rFonts w:ascii="EB Garamond" w:cs="EB Garamond" w:eastAsia="EB Garamond" w:hAnsi="EB Garamond"/>
+      <w:rFonts w:ascii="EB Garamond" w:hAnsi="EB Garamond" w:eastAsia="EB Garamond" w:cs="EB Garamond"/>
       <w:b/>
       <w:bCs/>
       <w:color w:val="000000"/>
@@ -1829,7 +1879,7 @@
       <w:szCs w:val="24"/>
     </w:rPr>
   </w:style>
-  <w:style w:styleId="Heading2" w:type="paragraph">
+  <w:style w:type="paragraph" w:styleId="Heading2">
     <w:name w:val="heading 2"/>
     <w:basedOn w:val="Normal"/>
     <w:next w:val="BodyText"/>
@@ -1839,12 +1889,12 @@
     <w:pPr>
       <w:keepNext/>
       <w:keepLines/>
-      <w:spacing w:after="240" w:before="240" w:line="240" w:lineRule="auto"/>
+      <w:spacing w:before="240" w:after="240" w:line="240" w:lineRule="auto"/>
       <w:jc w:val="center"/>
       <w:outlineLvl w:val="1"/>
     </w:pPr>
     <w:rPr>
-      <w:rFonts w:ascii="EB Garamond" w:cs="EB Garamond" w:eastAsia="EB Garamond" w:hAnsi="EB Garamond"/>
+      <w:rFonts w:ascii="EB Garamond" w:hAnsi="EB Garamond" w:eastAsia="EB Garamond" w:cs="EB Garamond"/>
       <w:b/>
       <w:bCs/>
       <w:color w:val="000000"/>
@@ -1852,7 +1902,7 @@
       <w:szCs w:val="24"/>
     </w:rPr>
   </w:style>
-  <w:style w:styleId="Heading3" w:type="paragraph">
+  <w:style w:type="paragraph" w:styleId="Heading3">
     <w:name w:val="heading 3"/>
     <w:basedOn w:val="Normal"/>
     <w:next w:val="BodyText"/>
@@ -1862,11 +1912,11 @@
     <w:pPr>
       <w:keepNext/>
       <w:keepLines/>
-      <w:spacing w:after="240" w:before="240" w:line="240" w:lineRule="auto"/>
+      <w:spacing w:before="240" w:after="240" w:line="240" w:lineRule="auto"/>
       <w:outlineLvl w:val="2"/>
     </w:pPr>
     <w:rPr>
-      <w:rFonts w:ascii="EB Garamond" w:cs="EB Garamond" w:eastAsia="EB Garamond" w:hAnsi="EB Garamond"/>
+      <w:rFonts w:ascii="EB Garamond" w:hAnsi="EB Garamond" w:eastAsia="EB Garamond" w:cs="EB Garamond"/>
       <w:b/>
       <w:bCs/>
       <w:color w:val="000000"/>
@@ -1874,7 +1924,7 @@
       <w:szCs w:val="24"/>
     </w:rPr>
   </w:style>
-  <w:style w:styleId="Heading4" w:type="paragraph">
+  <w:style w:type="paragraph" w:styleId="Heading4">
     <w:name w:val="heading 4"/>
     <w:basedOn w:val="Normal"/>
     <w:next w:val="BodyText"/>
@@ -1887,17 +1937,17 @@
     <w:pPr>
       <w:keepNext/>
       <w:keepLines/>
-      <w:spacing w:after="40" w:before="80"/>
+      <w:spacing w:before="80" w:after="40"/>
       <w:outlineLvl w:val="3"/>
     </w:pPr>
     <w:rPr>
-      <w:rFonts w:cstheme="majorBidi" w:eastAsiaTheme="majorEastAsia"/>
+      <w:rFonts w:eastAsiaTheme="majorEastAsia" w:cstheme="majorBidi"/>
       <w:i/>
       <w:iCs/>
-      <w:color w:themeColor="accent1" w:themeShade="BF" w:val="0F4761"/>
-    </w:rPr>
-  </w:style>
-  <w:style w:styleId="Heading5" w:type="paragraph">
+      <w:color w:val="0F4761" w:themeColor="accent1" w:themeShade="BF"/>
+    </w:rPr>
+  </w:style>
+  <w:style w:type="paragraph" w:styleId="Heading5">
     <w:name w:val="heading 5"/>
     <w:basedOn w:val="Normal"/>
     <w:next w:val="BodyText"/>
@@ -1910,15 +1960,15 @@
     <w:pPr>
       <w:keepNext/>
       <w:keepLines/>
-      <w:spacing w:after="40" w:before="80"/>
+      <w:spacing w:before="80" w:after="40"/>
       <w:outlineLvl w:val="4"/>
     </w:pPr>
     <w:rPr>
-      <w:rFonts w:cstheme="majorBidi" w:eastAsiaTheme="majorEastAsia"/>
-      <w:color w:themeColor="accent1" w:themeShade="BF" w:val="0F4761"/>
-    </w:rPr>
-  </w:style>
-  <w:style w:styleId="Heading6" w:type="paragraph">
+      <w:rFonts w:eastAsiaTheme="majorEastAsia" w:cstheme="majorBidi"/>
+      <w:color w:val="0F4761" w:themeColor="accent1" w:themeShade="BF"/>
+    </w:rPr>
+  </w:style>
+  <w:style w:type="paragraph" w:styleId="Heading6">
     <w:name w:val="heading 6"/>
     <w:basedOn w:val="Normal"/>
     <w:next w:val="BodyText"/>
@@ -1931,17 +1981,17 @@
     <w:pPr>
       <w:keepNext/>
       <w:keepLines/>
-      <w:spacing w:after="0" w:before="40"/>
+      <w:spacing w:before="40" w:after="0"/>
       <w:outlineLvl w:val="5"/>
     </w:pPr>
     <w:rPr>
-      <w:rFonts w:cstheme="majorBidi" w:eastAsiaTheme="majorEastAsia"/>
+      <w:rFonts w:eastAsiaTheme="majorEastAsia" w:cstheme="majorBidi"/>
       <w:i/>
       <w:iCs/>
-      <w:color w:themeColor="text1" w:themeTint="A6" w:val="595959"/>
-    </w:rPr>
-  </w:style>
-  <w:style w:styleId="Heading7" w:type="paragraph">
+      <w:color w:val="595959" w:themeColor="text1" w:themeTint="A6"/>
+    </w:rPr>
+  </w:style>
+  <w:style w:type="paragraph" w:styleId="Heading7">
     <w:name w:val="heading 7"/>
     <w:basedOn w:val="Normal"/>
     <w:next w:val="BodyText"/>
@@ -1954,15 +2004,15 @@
     <w:pPr>
       <w:keepNext/>
       <w:keepLines/>
-      <w:spacing w:after="0" w:before="40"/>
+      <w:spacing w:before="40" w:after="0"/>
       <w:outlineLvl w:val="6"/>
     </w:pPr>
     <w:rPr>
-      <w:rFonts w:cstheme="majorBidi" w:eastAsiaTheme="majorEastAsia"/>
-      <w:color w:themeColor="text1" w:themeTint="A6" w:val="595959"/>
-    </w:rPr>
-  </w:style>
-  <w:style w:styleId="Heading8" w:type="paragraph">
+      <w:rFonts w:eastAsiaTheme="majorEastAsia" w:cstheme="majorBidi"/>
+      <w:color w:val="595959" w:themeColor="text1" w:themeTint="A6"/>
+    </w:rPr>
+  </w:style>
+  <w:style w:type="paragraph" w:styleId="Heading8">
     <w:name w:val="heading 8"/>
     <w:basedOn w:val="Normal"/>
     <w:next w:val="BodyText"/>
@@ -1979,13 +2029,13 @@
       <w:outlineLvl w:val="7"/>
     </w:pPr>
     <w:rPr>
-      <w:rFonts w:cstheme="majorBidi" w:eastAsiaTheme="majorEastAsia"/>
+      <w:rFonts w:eastAsiaTheme="majorEastAsia" w:cstheme="majorBidi"/>
       <w:i/>
       <w:iCs/>
-      <w:color w:themeColor="text1" w:themeTint="D8" w:val="272727"/>
-    </w:rPr>
-  </w:style>
-  <w:style w:styleId="Heading9" w:type="paragraph">
+      <w:color w:val="272727" w:themeColor="text1" w:themeTint="D8"/>
+    </w:rPr>
+  </w:style>
+  <w:style w:type="paragraph" w:styleId="Heading9">
     <w:name w:val="heading 9"/>
     <w:basedOn w:val="Normal"/>
     <w:next w:val="BodyText"/>
@@ -2002,24 +2052,24 @@
       <w:outlineLvl w:val="8"/>
     </w:pPr>
     <w:rPr>
-      <w:rFonts w:cstheme="majorBidi" w:eastAsiaTheme="majorEastAsia"/>
-      <w:color w:themeColor="text1" w:themeTint="D8" w:val="272727"/>
-    </w:rPr>
-  </w:style>
-  <w:style w:customStyle="1" w:styleId="Heading1Char" w:type="character">
+      <w:rFonts w:eastAsiaTheme="majorEastAsia" w:cstheme="majorBidi"/>
+      <w:color w:val="272727" w:themeColor="text1" w:themeTint="D8"/>
+    </w:rPr>
+  </w:style>
+  <w:style w:type="character" w:customStyle="1" w:styleId="Heading1Char">
     <w:name w:val="Heading 1 Char"/>
     <w:basedOn w:val="DefaultParagraphFont"/>
     <w:link w:val="Heading1"/>
     <w:uiPriority w:val="9"/>
     <w:rsid w:val="00A10FD9"/>
     <w:rPr>
-      <w:rFonts w:asciiTheme="majorHAnsi" w:cstheme="majorBidi" w:eastAsiaTheme="majorEastAsia" w:hAnsiTheme="majorHAnsi"/>
-      <w:color w:themeColor="accent1" w:themeShade="BF" w:val="0F4761"/>
+      <w:rFonts w:asciiTheme="majorHAnsi" w:eastAsiaTheme="majorEastAsia" w:hAnsiTheme="majorHAnsi" w:cstheme="majorBidi"/>
+      <w:color w:val="0F4761" w:themeColor="accent1" w:themeShade="BF"/>
       <w:sz w:val="40"/>
       <w:szCs w:val="40"/>
     </w:rPr>
   </w:style>
-  <w:style w:customStyle="1" w:styleId="Heading2Char" w:type="character">
+  <w:style w:type="character" w:customStyle="1" w:styleId="Heading2Char">
     <w:name w:val="Heading 2 Char"/>
     <w:basedOn w:val="DefaultParagraphFont"/>
     <w:link w:val="Heading2"/>
@@ -2027,13 +2077,13 @@
     <w:semiHidden/>
     <w:rsid w:val="00A10FD9"/>
     <w:rPr>
-      <w:rFonts w:asciiTheme="majorHAnsi" w:cstheme="majorBidi" w:eastAsiaTheme="majorEastAsia" w:hAnsiTheme="majorHAnsi"/>
-      <w:color w:themeColor="accent1" w:themeShade="BF" w:val="0F4761"/>
+      <w:rFonts w:asciiTheme="majorHAnsi" w:eastAsiaTheme="majorEastAsia" w:hAnsiTheme="majorHAnsi" w:cstheme="majorBidi"/>
+      <w:color w:val="0F4761" w:themeColor="accent1" w:themeShade="BF"/>
       <w:sz w:val="32"/>
       <w:szCs w:val="32"/>
     </w:rPr>
   </w:style>
-  <w:style w:customStyle="1" w:styleId="Heading3Char" w:type="character">
+  <w:style w:type="character" w:customStyle="1" w:styleId="Heading3Char">
     <w:name w:val="Heading 3 Char"/>
     <w:basedOn w:val="DefaultParagraphFont"/>
     <w:link w:val="Heading3"/>
@@ -2041,13 +2091,13 @@
     <w:semiHidden/>
     <w:rsid w:val="00A10FD9"/>
     <w:rPr>
-      <w:rFonts w:cstheme="majorBidi" w:eastAsiaTheme="majorEastAsia"/>
-      <w:color w:themeColor="accent1" w:themeShade="BF" w:val="0F4761"/>
+      <w:rFonts w:eastAsiaTheme="majorEastAsia" w:cstheme="majorBidi"/>
+      <w:color w:val="0F4761" w:themeColor="accent1" w:themeShade="BF"/>
       <w:sz w:val="28"/>
       <w:szCs w:val="28"/>
     </w:rPr>
   </w:style>
-  <w:style w:customStyle="1" w:styleId="Heading4Char" w:type="character">
+  <w:style w:type="character" w:customStyle="1" w:styleId="Heading4Char">
     <w:name w:val="Heading 4 Char"/>
     <w:basedOn w:val="DefaultParagraphFont"/>
     <w:link w:val="Heading4"/>
@@ -2055,13 +2105,13 @@
     <w:semiHidden/>
     <w:rsid w:val="00A10FD9"/>
     <w:rPr>
-      <w:rFonts w:cstheme="majorBidi" w:eastAsiaTheme="majorEastAsia"/>
+      <w:rFonts w:eastAsiaTheme="majorEastAsia" w:cstheme="majorBidi"/>
       <w:i/>
       <w:iCs/>
-      <w:color w:themeColor="accent1" w:themeShade="BF" w:val="0F4761"/>
-    </w:rPr>
-  </w:style>
-  <w:style w:customStyle="1" w:styleId="Heading5Char" w:type="character">
+      <w:color w:val="0F4761" w:themeColor="accent1" w:themeShade="BF"/>
+    </w:rPr>
+  </w:style>
+  <w:style w:type="character" w:customStyle="1" w:styleId="Heading5Char">
     <w:name w:val="Heading 5 Char"/>
     <w:basedOn w:val="DefaultParagraphFont"/>
     <w:link w:val="Heading5"/>
@@ -2069,11 +2119,11 @@
     <w:semiHidden/>
     <w:rsid w:val="00A10FD9"/>
     <w:rPr>
-      <w:rFonts w:cstheme="majorBidi" w:eastAsiaTheme="majorEastAsia"/>
-      <w:color w:themeColor="accent1" w:themeShade="BF" w:val="0F4761"/>
-    </w:rPr>
-  </w:style>
-  <w:style w:customStyle="1" w:styleId="Heading6Char" w:type="character">
+      <w:rFonts w:eastAsiaTheme="majorEastAsia" w:cstheme="majorBidi"/>
+      <w:color w:val="0F4761" w:themeColor="accent1" w:themeShade="BF"/>
+    </w:rPr>
+  </w:style>
+  <w:style w:type="character" w:customStyle="1" w:styleId="Heading6Char">
     <w:name w:val="Heading 6 Char"/>
     <w:basedOn w:val="DefaultParagraphFont"/>
     <w:link w:val="Heading6"/>
@@ -2081,13 +2131,13 @@
     <w:semiHidden/>
     <w:rsid w:val="00A10FD9"/>
     <w:rPr>
-      <w:rFonts w:cstheme="majorBidi" w:eastAsiaTheme="majorEastAsia"/>
+      <w:rFonts w:eastAsiaTheme="majorEastAsia" w:cstheme="majorBidi"/>
       <w:i/>
       <w:iCs/>
-      <w:color w:themeColor="text1" w:themeTint="A6" w:val="595959"/>
-    </w:rPr>
-  </w:style>
-  <w:style w:customStyle="1" w:styleId="Heading7Char" w:type="character">
+      <w:color w:val="595959" w:themeColor="text1" w:themeTint="A6"/>
+    </w:rPr>
+  </w:style>
+  <w:style w:type="character" w:customStyle="1" w:styleId="Heading7Char">
     <w:name w:val="Heading 7 Char"/>
     <w:basedOn w:val="DefaultParagraphFont"/>
     <w:link w:val="Heading7"/>
@@ -2095,11 +2145,11 @@
     <w:semiHidden/>
     <w:rsid w:val="00A10FD9"/>
     <w:rPr>
-      <w:rFonts w:cstheme="majorBidi" w:eastAsiaTheme="majorEastAsia"/>
-      <w:color w:themeColor="text1" w:themeTint="A6" w:val="595959"/>
-    </w:rPr>
-  </w:style>
-  <w:style w:customStyle="1" w:styleId="Heading8Char" w:type="character">
+      <w:rFonts w:eastAsiaTheme="majorEastAsia" w:cstheme="majorBidi"/>
+      <w:color w:val="595959" w:themeColor="text1" w:themeTint="A6"/>
+    </w:rPr>
+  </w:style>
+  <w:style w:type="character" w:customStyle="1" w:styleId="Heading8Char">
     <w:name w:val="Heading 8 Char"/>
     <w:basedOn w:val="DefaultParagraphFont"/>
     <w:link w:val="Heading8"/>
@@ -2107,13 +2157,13 @@
     <w:semiHidden/>
     <w:rsid w:val="00A10FD9"/>
     <w:rPr>
-      <w:rFonts w:cstheme="majorBidi" w:eastAsiaTheme="majorEastAsia"/>
+      <w:rFonts w:eastAsiaTheme="majorEastAsia" w:cstheme="majorBidi"/>
       <w:i/>
       <w:iCs/>
-      <w:color w:themeColor="text1" w:themeTint="D8" w:val="272727"/>
-    </w:rPr>
-  </w:style>
-  <w:style w:customStyle="1" w:styleId="Heading9Char" w:type="character">
+      <w:color w:val="272727" w:themeColor="text1" w:themeTint="D8"/>
+    </w:rPr>
+  </w:style>
+  <w:style w:type="character" w:customStyle="1" w:styleId="Heading9Char">
     <w:name w:val="Heading 9 Char"/>
     <w:basedOn w:val="DefaultParagraphFont"/>
     <w:link w:val="Heading9"/>
@@ -2121,11 +2171,11 @@
     <w:semiHidden/>
     <w:rsid w:val="00A10FD9"/>
     <w:rPr>
-      <w:rFonts w:cstheme="majorBidi" w:eastAsiaTheme="majorEastAsia"/>
-      <w:color w:themeColor="text1" w:themeTint="D8" w:val="272727"/>
-    </w:rPr>
-  </w:style>
-  <w:style w:styleId="BlockText" w:type="paragraph">
+      <w:rFonts w:eastAsiaTheme="majorEastAsia" w:cstheme="majorBidi"/>
+      <w:color w:val="272727" w:themeColor="text1" w:themeTint="D8"/>
+    </w:rPr>
+  </w:style>
+  <w:style w:type="paragraph" w:styleId="BlockText">
     <w:name w:val="Block Text"/>
     <w:basedOn w:val="BodyText"/>
     <w:next w:val="BodyText"/>
@@ -2133,26 +2183,26 @@
     <w:unhideWhenUsed/>
     <w:qFormat/>
     <w:pPr>
-      <w:spacing w:after="100" w:before="100"/>
+      <w:spacing w:before="100" w:after="100"/>
       <w:ind w:firstLine="0" w:left="480" w:right="480"/>
     </w:pPr>
   </w:style>
-  <w:style w:styleId="FootnoteText" w:type="paragraph">
+  <w:style w:type="paragraph" w:styleId="FootnoteText">
     <w:name w:val="footnote text"/>
     <w:basedOn w:val="Normal"/>
     <w:uiPriority w:val="99"/>
     <w:unhideWhenUsed/>
     <w:pPr>
-      <w:spacing w:after="100" w:before="0" w:line="240" w:lineRule="auto"/>
+      <w:spacing w:before="0" w:after="100" w:line="240" w:lineRule="auto"/>
       <w:ind w:firstLine="0"/>
     </w:pPr>
     <w:rPr>
-      <w:rFonts w:ascii="EB Garamond" w:cs="EB Garamond" w:eastAsia="EB Garamond" w:hAnsi="EB Garamond"/>
+      <w:rFonts w:ascii="EB Garamond" w:hAnsi="EB Garamond" w:eastAsia="EB Garamond" w:cs="EB Garamond"/>
       <w:sz w:val="24"/>
       <w:szCs w:val="24"/>
     </w:rPr>
   </w:style>
-  <w:style w:styleId="FootnoteBlockText" w:type="paragraph">
+  <w:style w:type="paragraph" w:styleId="FootnoteBlockText">
     <w:name w:val="Footnote Block Text"/>
     <w:basedOn w:val="FootnoteText"/>
     <w:next w:val="FootnoteText"/>
@@ -2160,34 +2210,34 @@
     <w:unhideWhenUsed/>
     <w:qFormat/>
     <w:pPr>
-      <w:spacing w:after="100" w:before="100"/>
+      <w:spacing w:before="100" w:after="100"/>
       <w:ind w:firstLine="0" w:left="480" w:right="480"/>
     </w:pPr>
   </w:style>
-  <w:style w:default="1" w:styleId="DefaultParagraphFont" w:type="character">
+  <w:style w:type="character" w:default="1" w:styleId="DefaultParagraphFont">
     <w:name w:val="Default Paragraph Font"/>
     <w:semiHidden/>
     <w:unhideWhenUsed/>
   </w:style>
-  <w:style w:default="1" w:styleId="Table" w:type="table">
+  <w:style w:type="table" w:default="1" w:styleId="Table">
     <w:name w:val="Table"/>
     <w:basedOn w:val="TableNormal"/>
     <w:semiHidden/>
     <w:unhideWhenUsed/>
     <w:qFormat/>
     <w:tblPr>
-      <w:tblInd w:type="dxa" w:w="0"/>
+      <w:tblInd w:w="0" w:type="dxa"/>
       <w:tblCellMar>
-        <w:top w:type="dxa" w:w="0"/>
-        <w:left w:type="dxa" w:w="108"/>
-        <w:bottom w:type="dxa" w:w="0"/>
-        <w:right w:type="dxa" w:w="108"/>
+        <w:top w:w="0" w:type="dxa"/>
+        <w:left w:w="108" w:type="dxa"/>
+        <w:bottom w:w="0" w:type="dxa"/>
+        <w:right w:w="108" w:type="dxa"/>
       </w:tblCellMar>
     </w:tblPr>
     <w:tblStylePr w:type="firstRow">
       <w:tblPr>
         <w:jc w:val="left"/>
-        <w:tblInd w:type="dxa" w:w="0"/>
+        <w:tblInd w:w="0" w:type="dxa"/>
       </w:tblPr>
       <w:trPr>
         <w:jc w:val="left"/>
@@ -2200,7 +2250,7 @@
       </w:tcPr>
     </w:tblStylePr>
   </w:style>
-  <w:style w:customStyle="1" w:styleId="DefinitionTerm" w:type="paragraph">
+  <w:style w:type="paragraph" w:customStyle="1" w:styleId="DefinitionTerm">
     <w:name w:val="Definition Term"/>
     <w:basedOn w:val="Normal"/>
     <w:next w:val="Definition"/>
@@ -2213,49 +2263,49 @@
       <w:b/>
     </w:rPr>
   </w:style>
-  <w:style w:customStyle="1" w:styleId="Definition" w:type="paragraph">
+  <w:style w:type="paragraph" w:customStyle="1" w:styleId="Definition">
     <w:name w:val="Definition"/>
     <w:basedOn w:val="Normal"/>
   </w:style>
-  <w:style w:styleId="Caption" w:type="paragraph">
+  <w:style w:type="paragraph" w:styleId="Caption">
     <w:name w:val="Caption"/>
     <w:basedOn w:val="Normal"/>
     <w:link w:val="BodyTextChar"/>
     <w:pPr>
-      <w:spacing w:after="120" w:before="0"/>
+      <w:spacing w:before="0" w:after="120"/>
     </w:pPr>
     <w:rPr>
       <w:i/>
     </w:rPr>
   </w:style>
-  <w:style w:customStyle="1" w:styleId="TableCaption" w:type="paragraph">
+  <w:style w:type="paragraph" w:customStyle="1" w:styleId="TableCaption">
     <w:name w:val="Table Caption"/>
     <w:basedOn w:val="Caption"/>
     <w:pPr>
       <w:keepNext/>
     </w:pPr>
   </w:style>
-  <w:style w:customStyle="1" w:styleId="ImageCaption" w:type="paragraph">
+  <w:style w:type="paragraph" w:customStyle="1" w:styleId="ImageCaption">
     <w:name w:val="Image Caption"/>
     <w:basedOn w:val="Caption"/>
   </w:style>
-  <w:style w:customStyle="1" w:styleId="Figure" w:type="paragraph">
+  <w:style w:type="paragraph" w:customStyle="1" w:styleId="Figure">
     <w:name w:val="Figure"/>
     <w:basedOn w:val="Normal"/>
   </w:style>
-  <w:style w:customStyle="1" w:styleId="CaptionedFigure" w:type="paragraph">
+  <w:style w:type="paragraph" w:customStyle="1" w:styleId="CaptionedFigure">
     <w:name w:val="Captioned Figure"/>
     <w:basedOn w:val="Figure"/>
     <w:pPr>
       <w:keepNext/>
     </w:pPr>
   </w:style>
-  <w:style w:customStyle="1" w:styleId="BodyTextChar" w:type="character">
+  <w:style w:type="character" w:customStyle="1" w:styleId="BodyTextChar">
     <w:name w:val="Body Text Char"/>
     <w:basedOn w:val="DefaultParagraphFont"/>
     <w:link w:val="BodyText"/>
   </w:style>
-  <w:style w:customStyle="1" w:styleId="VerbatimChar" w:type="character">
+  <w:style w:type="character" w:customStyle="1" w:styleId="VerbatimChar">
     <w:name w:val="Verbatim Char"/>
     <w:basedOn w:val="BodyTextChar"/>
     <w:rPr>
@@ -2263,25 +2313,25 @@
       <w:sz w:val="22"/>
     </w:rPr>
   </w:style>
-  <w:style w:customStyle="1" w:styleId="SectionNumber" w:type="character">
+  <w:style w:type="character" w:customStyle="1" w:styleId="SectionNumber">
     <w:name w:val="Section Number"/>
     <w:basedOn w:val="BodyTextChar"/>
   </w:style>
-  <w:style w:styleId="FootnoteReference" w:type="character">
+  <w:style w:type="character" w:styleId="FootnoteReference">
     <w:name w:val="Footnote Reference"/>
     <w:basedOn w:val="BodyTextChar"/>
     <w:rPr>
       <w:vertAlign w:val="superscript"/>
     </w:rPr>
   </w:style>
-  <w:style w:styleId="Hyperlink" w:type="character">
+  <w:style w:type="character" w:styleId="Hyperlink">
     <w:name w:val="Hyperlink"/>
     <w:basedOn w:val="BodyTextChar"/>
     <w:rPr>
-      <w:color w:themeColor="accent1" w:val="4F81BD"/>
-    </w:rPr>
-  </w:style>
-  <w:style w:styleId="TOCHeading" w:type="paragraph">
+      <w:color w:val="4F81BD" w:themeColor="accent1"/>
+    </w:rPr>
+  </w:style>
+  <w:style w:type="paragraph" w:styleId="TOCHeading">
     <w:name w:val="TOC Heading"/>
     <w:basedOn w:val="Heading1"/>
     <w:next w:val="BodyText"/>
@@ -2293,154 +2343,154 @@
       <w:outlineLvl w:val="9"/>
     </w:pPr>
     <w:rPr>
-      <w:rFonts w:asciiTheme="majorHAnsi" w:cstheme="majorBidi" w:eastAsiaTheme="majorEastAsia" w:hAnsiTheme="majorHAnsi"/>
+      <w:rFonts w:asciiTheme="majorHAnsi" w:eastAsiaTheme="majorEastAsia" w:hAnsiTheme="majorHAnsi" w:cstheme="majorBidi"/>
       <w:b w:val="0"/>
       <w:bCs w:val="0"/>
-      <w:color w:themeColor="accent1" w:themeShade="BF" w:val="365F91"/>
-    </w:rPr>
-  </w:style>
-  <w:style w:styleId="Footer" w:type="paragraph">
+      <w:color w:val="365F91" w:themeColor="accent1" w:themeShade="BF"/>
+    </w:rPr>
+  </w:style>
+  <w:style w:type="paragraph" w:styleId="Footer">
     <w:name w:val="footer"/>
     <w:basedOn w:val="Normal"/>
     <w:pPr>
-      <w:spacing w:after="0" w:before="0" w:line="240" w:lineRule="auto"/>
+      <w:spacing w:before="0" w:after="0" w:line="240" w:lineRule="auto"/>
       <w:jc w:val="center"/>
     </w:pPr>
     <w:rPr>
-      <w:rFonts w:ascii="EB Garamond" w:cs="EB Garamond" w:eastAsia="EB Garamond" w:hAnsi="EB Garamond"/>
+      <w:rFonts w:ascii="EB Garamond" w:hAnsi="EB Garamond" w:eastAsia="EB Garamond" w:cs="EB Garamond"/>
       <w:color w:val="000000"/>
       <w:sz w:val="24"/>
       <w:szCs w:val="24"/>
     </w:rPr>
   </w:style>
-  <w:style w:customStyle="1" w:styleId="Centered" w:type="paragraph">
+  <w:style w:type="paragraph" w:customStyle="1" w:styleId="Centered">
     <w:name w:val="Centered"/>
     <w:basedOn w:val="Normal"/>
     <w:qFormat/>
     <w:pPr>
-      <w:spacing w:after="0" w:before="0" w:line="240" w:lineRule="auto"/>
+      <w:spacing w:before="0" w:after="0" w:line="240" w:lineRule="auto"/>
       <w:ind w:firstLine="0"/>
       <w:jc w:val="center"/>
     </w:pPr>
   </w:style>
-  <w:style w:customStyle="1" w:styleId="Single" w:type="paragraph">
+  <w:style w:type="paragraph" w:customStyle="1" w:styleId="Single">
     <w:name w:val="Single"/>
     <w:basedOn w:val="Normal"/>
     <w:qFormat/>
     <w:pPr>
-      <w:spacing w:after="0" w:before="0" w:line="240" w:lineRule="auto"/>
+      <w:spacing w:before="0" w:after="0" w:line="240" w:lineRule="auto"/>
       <w:ind w:firstLine="0"/>
     </w:pPr>
   </w:style>
-  <w:style w:customStyle="1" w:styleId="CaptionLine" w:type="paragraph">
+  <w:style w:type="paragraph" w:customStyle="1" w:styleId="CaptionLine">
     <w:name w:val="CaptionLine"/>
     <w:basedOn w:val="Normal"/>
     <w:qFormat/>
     <w:pPr>
-      <w:spacing w:after="0" w:before="0" w:line="280" w:lineRule="exact"/>
+      <w:spacing w:before="0" w:after="0" w:line="280" w:lineRule="exact"/>
       <w:ind w:firstLine="0"/>
     </w:pPr>
   </w:style>
-  <w:style w:customStyle="1" w:styleId="CaptionCenter" w:type="paragraph">
+  <w:style w:type="paragraph" w:customStyle="1" w:styleId="CaptionCenter">
     <w:name w:val="CaptionCenter"/>
     <w:basedOn w:val="CaptionLine"/>
     <w:qFormat/>
     <w:pPr>
-      <w:spacing w:after="0" w:before="0" w:line="280" w:lineRule="exact"/>
+      <w:spacing w:before="0" w:after="0" w:line="280" w:lineRule="exact"/>
       <w:ind w:firstLine="0"/>
       <w:jc w:val="center"/>
     </w:pPr>
   </w:style>
-  <w:style w:customStyle="1" w:styleId="CaptionIndent" w:type="paragraph">
+  <w:style w:type="paragraph" w:customStyle="1" w:styleId="CaptionIndent">
     <w:name w:val="CaptionIndent"/>
     <w:basedOn w:val="CaptionLine"/>
     <w:qFormat/>
     <w:pPr>
-      <w:spacing w:after="0" w:before="0" w:line="280" w:lineRule="exact"/>
-      <w:ind w:firstLine="0" w:left="2016"/>
-    </w:pPr>
-  </w:style>
-  <w:style w:customStyle="1" w:styleId="CaptionRight" w:type="paragraph">
+      <w:spacing w:before="0" w:after="0" w:line="280" w:lineRule="exact"/>
+      <w:ind w:left="2016" w:firstLine="0"/>
+    </w:pPr>
+  </w:style>
+  <w:style w:type="paragraph" w:customStyle="1" w:styleId="CaptionRight">
     <w:name w:val="CaptionRight"/>
     <w:basedOn w:val="CaptionLine"/>
     <w:qFormat/>
     <w:pPr>
-      <w:spacing w:after="0" w:before="0" w:line="280" w:lineRule="exact"/>
-      <w:ind w:firstLine="0" w:left="360"/>
-    </w:pPr>
-  </w:style>
-  <w:style w:customStyle="1" w:styleId="Gap24" w:type="paragraph">
+      <w:spacing w:before="0" w:after="0" w:line="280" w:lineRule="exact"/>
+      <w:ind w:left="360" w:firstLine="0"/>
+    </w:pPr>
+  </w:style>
+  <w:style w:type="paragraph" w:customStyle="1" w:styleId="Gap24">
     <w:name w:val="Gap24"/>
     <w:basedOn w:val="Normal"/>
     <w:qFormat/>
     <w:pPr>
-      <w:spacing w:after="0" w:before="0" w:line="480" w:lineRule="exact"/>
+      <w:spacing w:before="0" w:after="0" w:line="480" w:lineRule="exact"/>
       <w:ind w:firstLine="0"/>
     </w:pPr>
   </w:style>
-  <w:style w:customStyle="1" w:styleId="SigIndent" w:type="paragraph">
+  <w:style w:type="paragraph" w:customStyle="1" w:styleId="SigIndent">
     <w:name w:val="SigIndent"/>
     <w:basedOn w:val="Single"/>
     <w:qFormat/>
     <w:pPr>
       <w:keepNext/>
       <w:keepLines/>
-      <w:spacing w:after="0" w:before="0" w:line="240" w:lineRule="auto"/>
-      <w:ind w:firstLine="0" w:left="4680"/>
-    </w:pPr>
-  </w:style>
-  <w:style w:customStyle="1" w:styleId="SigAfterGap" w:type="paragraph">
+      <w:spacing w:before="0" w:after="0" w:line="240" w:lineRule="auto"/>
+      <w:ind w:left="4680" w:firstLine="0"/>
+    </w:pPr>
+  </w:style>
+  <w:style w:type="paragraph" w:customStyle="1" w:styleId="SigAfterGap">
     <w:name w:val="SigAfterGap"/>
     <w:basedOn w:val="SigIndent"/>
     <w:qFormat/>
     <w:pPr>
       <w:keepNext/>
-      <w:spacing w:after="0" w:before="144" w:line="240" w:lineRule="auto"/>
-      <w:ind w:firstLine="0" w:left="4680"/>
-    </w:pPr>
-  </w:style>
-  <w:style w:customStyle="1" w:styleId="SigIndent30" w:type="paragraph">
+      <w:spacing w:before="144" w:after="0" w:line="240" w:lineRule="auto"/>
+      <w:ind w:left="4680" w:firstLine="0"/>
+    </w:pPr>
+  </w:style>
+  <w:style w:type="paragraph" w:customStyle="1" w:styleId="SigIndent30">
     <w:name w:val="SigIndent30"/>
     <w:basedOn w:val="Single"/>
     <w:qFormat/>
     <w:pPr>
       <w:keepNext/>
       <w:keepLines/>
-      <w:spacing w:after="0" w:before="0" w:line="240" w:lineRule="auto"/>
-      <w:ind w:firstLine="0" w:left="4320"/>
-    </w:pPr>
-  </w:style>
-  <w:style w:customStyle="1" w:styleId="SigAfterGap30" w:type="paragraph">
+      <w:spacing w:before="0" w:after="0" w:line="240" w:lineRule="auto"/>
+      <w:ind w:left="4320" w:firstLine="0"/>
+    </w:pPr>
+  </w:style>
+  <w:style w:type="paragraph" w:customStyle="1" w:styleId="SigAfterGap30">
     <w:name w:val="SigAfterGap30"/>
     <w:basedOn w:val="SigIndent30"/>
     <w:qFormat/>
     <w:pPr>
       <w:keepNext/>
-      <w:spacing w:after="0" w:before="144" w:line="240" w:lineRule="auto"/>
-      <w:ind w:firstLine="0" w:left="4320"/>
-    </w:pPr>
-  </w:style>
-  <w:style w:customStyle="1" w:styleId="PrayerItem" w:type="paragraph">
+      <w:spacing w:before="144" w:after="0" w:line="240" w:lineRule="auto"/>
+      <w:ind w:left="4320" w:firstLine="0"/>
+    </w:pPr>
+  </w:style>
+  <w:style w:type="paragraph" w:customStyle="1" w:styleId="PrayerItem">
     <w:name w:val="PrayerItem"/>
     <w:basedOn w:val="BodyText"/>
     <w:qFormat/>
     <w:pPr>
-      <w:spacing w:after="0" w:before="120" w:line="480" w:lineRule="exact"/>
-      <w:ind w:hanging="720" w:left="1440"/>
-    </w:pPr>
-  </w:style>
-  <w:style w:customStyle="1" w:styleId="HeadingHang" w:type="paragraph">
+      <w:spacing w:before="120" w:after="0" w:line="480" w:lineRule="exact"/>
+      <w:ind w:left="1440" w:hanging="720"/>
+    </w:pPr>
+  </w:style>
+  <w:style w:type="paragraph" w:customStyle="1" w:styleId="HeadingHang">
     <w:name w:val="HeadingHang"/>
     <w:basedOn w:val="Normal"/>
     <w:qFormat/>
     <w:pPr>
       <w:keepNext/>
       <w:keepLines/>
-      <w:spacing w:after="240" w:before="240" w:line="240" w:lineRule="auto"/>
-      <w:ind w:hanging="720" w:left="720"/>
-    </w:pPr>
-    <w:rPr>
-      <w:rFonts w:ascii="EB Garamond" w:cs="EB Garamond" w:eastAsia="EB Garamond" w:hAnsi="EB Garamond"/>
+      <w:spacing w:before="240" w:after="240" w:line="240" w:lineRule="auto"/>
+      <w:ind w:left="720" w:hanging="720"/>
+    </w:pPr>
+    <w:rPr>
+      <w:rFonts w:ascii="EB Garamond" w:hAnsi="EB Garamond" w:eastAsia="EB Garamond" w:cs="EB Garamond"/>
       <w:b/>
       <w:bCs/>
       <w:color w:val="000000"/>
@@ -2448,18 +2498,18 @@
       <w:szCs w:val="24"/>
     </w:rPr>
   </w:style>
-  <w:style w:customStyle="1" w:styleId="HeadingHang3" w:type="paragraph">
+  <w:style w:type="paragraph" w:customStyle="1" w:styleId="HeadingHang3">
     <w:name w:val="HeadingHang3"/>
     <w:basedOn w:val="Normal"/>
     <w:qFormat/>
     <w:pPr>
       <w:keepNext/>
       <w:keepLines/>
-      <w:spacing w:after="240" w:before="240" w:line="240" w:lineRule="auto"/>
-      <w:ind w:hanging="720" w:left="1440"/>
-    </w:pPr>
-    <w:rPr>
-      <w:rFonts w:ascii="EB Garamond" w:cs="EB Garamond" w:eastAsia="EB Garamond" w:hAnsi="EB Garamond"/>
+      <w:spacing w:before="240" w:after="240" w:line="240" w:lineRule="auto"/>
+      <w:ind w:left="1440" w:hanging="720"/>
+    </w:pPr>
+    <w:rPr>
+      <w:rFonts w:ascii="EB Garamond" w:hAnsi="EB Garamond" w:eastAsia="EB Garamond" w:cs="EB Garamond"/>
       <w:b/>
       <w:bCs/>
       <w:color w:val="000000"/>
@@ -2467,18 +2517,18 @@
       <w:szCs w:val="24"/>
     </w:rPr>
   </w:style>
-  <w:style w:customStyle="1" w:styleId="MotionH1" w:type="paragraph">
+  <w:style w:type="paragraph" w:customStyle="1" w:styleId="MotionH1">
     <w:name w:val="MotionH1"/>
     <w:basedOn w:val="Normal"/>
     <w:qFormat/>
     <w:pPr>
       <w:keepNext/>
       <w:keepLines/>
-      <w:spacing w:after="240" w:before="360" w:line="240" w:lineRule="auto"/>
+      <w:spacing w:before="360" w:after="240" w:line="240" w:lineRule="auto"/>
       <w:jc w:val="center"/>
     </w:pPr>
     <w:rPr>
-      <w:rFonts w:ascii="EB Garamond" w:cs="EB Garamond" w:eastAsia="EB Garamond" w:hAnsi="EB Garamond"/>
+      <w:rFonts w:ascii="EB Garamond" w:hAnsi="EB Garamond" w:eastAsia="EB Garamond" w:cs="EB Garamond"/>
       <w:b/>
       <w:bCs/>
       <w:color w:val="000000"/>
@@ -2486,17 +2536,17 @@
       <w:szCs w:val="24"/>
     </w:rPr>
   </w:style>
-  <w:style w:customStyle="1" w:styleId="TitleBlock" w:type="paragraph">
+  <w:style w:type="paragraph" w:customStyle="1" w:styleId="TitleBlock">
     <w:name w:val="TitleBlock"/>
     <w:basedOn w:val="Normal"/>
     <w:qFormat/>
     <w:pPr>
-      <w:spacing w:after="0" w:before="0" w:line="240" w:lineRule="auto"/>
-      <w:ind w:firstLine="0" w:left="936" w:right="936"/>
+      <w:spacing w:before="0" w:after="0" w:line="240" w:lineRule="auto"/>
+      <w:ind w:left="936" w:right="936" w:firstLine="0"/>
       <w:jc w:val="center"/>
     </w:pPr>
     <w:rPr>
-      <w:rFonts w:ascii="EB Garamond" w:cs="EB Garamond" w:eastAsia="EB Garamond" w:hAnsi="EB Garamond"/>
+      <w:rFonts w:ascii="EB Garamond" w:hAnsi="EB Garamond" w:eastAsia="EB Garamond" w:cs="EB Garamond"/>
       <w:b/>
       <w:bCs/>
       <w:color w:val="000000"/>
@@ -2504,24 +2554,24 @@
       <w:szCs w:val="24"/>
     </w:rPr>
   </w:style>
-  <w:style w:customStyle="1" w:styleId="Recipient" w:type="paragraph">
+  <w:style w:type="paragraph" w:customStyle="1" w:styleId="Recipient">
     <w:name w:val="Recipient"/>
     <w:basedOn w:val="Single"/>
     <w:qFormat/>
     <w:pPr>
-      <w:spacing w:after="120" w:before="0" w:line="240" w:lineRule="auto"/>
-      <w:ind w:firstLine="0" w:left="1440"/>
-    </w:pPr>
-  </w:style>
-  <w:style w:customStyle="1" w:styleId="DateLine" w:type="paragraph">
+      <w:spacing w:before="0" w:after="120" w:line="240" w:lineRule="auto"/>
+      <w:ind w:left="1440" w:firstLine="0"/>
+    </w:pPr>
+  </w:style>
+  <w:style w:type="paragraph" w:customStyle="1" w:styleId="DateLine">
     <w:name w:val="DateLine"/>
     <w:basedOn w:val="Single"/>
     <w:qFormat/>
     <w:pPr>
       <w:tabs>
-        <w:tab w:pos="9360" w:val="right"/>
+        <w:tab w:val="right" w:pos="9360"/>
       </w:tabs>
-      <w:spacing w:after="0" w:before="0" w:line="240" w:lineRule="auto"/>
+      <w:spacing w:before="0" w:after="0" w:line="240" w:lineRule="auto"/>
       <w:ind w:firstLine="0"/>
     </w:pPr>
   </w:style>

</xml_diff>